<commit_message>
Time Log Ovcharenko 27.09.2026
</commit_message>
<xml_diff>
--- a/Reports, Logs & Evaluations/Peer Evaluations/Ovcharenko/Peer Evaluation Weekly.docx
+++ b/Reports, Logs & Evaluations/Peer Evaluations/Ovcharenko/Peer Evaluation Weekly.docx
@@ -849,7 +849,17 @@
                 <w:szCs w:val="22"/>
                 <w:lang w:val="en-US" w:eastAsia="en-US" w:bidi="ar-SA"/>
               </w:rPr>
-              <w:t>Week 2 ...</w:t>
+              <w:t xml:space="preserve">Week 2 </w:t>
+            </w:r>
+            <w:r>
+              <w:rPr>
+                <w:rFonts w:eastAsia="Calibri" w:cs=""/>
+                <w:kern w:val="0"/>
+                <w:sz w:val="22"/>
+                <w:szCs w:val="22"/>
+                <w:lang w:val="en-US" w:eastAsia="en-US" w:bidi="ar-SA"/>
+              </w:rPr>
+              <w:t>09/21/26- 09/27/26</w:t>
             </w:r>
           </w:p>
           <w:p>
@@ -906,6 +916,17 @@
                 <w:szCs w:val="22"/>
                 <w:lang w:val="en-US" w:eastAsia="en-US" w:bidi="ar-SA"/>
               </w:rPr>
+              <w:t xml:space="preserve">Video Meeting </w:t>
+            </w:r>
+            <w:r>
+              <w:rPr>
+                <w:rFonts w:eastAsia="Calibri" w:cs=""/>
+                <w:kern w:val="0"/>
+                <w:sz w:val="22"/>
+                <w:szCs w:val="22"/>
+                <w:lang w:val="en-US" w:eastAsia="en-US" w:bidi="ar-SA"/>
+              </w:rPr>
+              <w:t>Handling and Admin</w:t>
             </w:r>
           </w:p>
         </w:tc>
@@ -937,6 +958,7 @@
                 <w:szCs w:val="22"/>
                 <w:lang w:val="en-US" w:eastAsia="en-US" w:bidi="ar-SA"/>
               </w:rPr>
+              <w:t>100%</w:t>
             </w:r>
           </w:p>
         </w:tc>
@@ -953,21 +975,14 @@
               <w:spacing w:lineRule="auto" w:line="240" w:before="0" w:after="0"/>
               <w:jc w:val="center"/>
               <w:rPr>
-                <w:rFonts w:ascii="Calibri" w:hAnsi="Calibri" w:eastAsia="Calibri" w:cs=""/>
-                <w:kern w:val="0"/>
-                <w:sz w:val="22"/>
-                <w:szCs w:val="22"/>
-                <w:lang w:val="en-US" w:eastAsia="en-US" w:bidi="ar-SA"/>
-              </w:rPr>
-            </w:pPr>
-            <w:r>
-              <w:rPr>
-                <w:rFonts w:eastAsia="Calibri" w:cs=""/>
-                <w:kern w:val="0"/>
-                <w:sz w:val="22"/>
-                <w:szCs w:val="22"/>
-                <w:lang w:val="en-US" w:eastAsia="en-US" w:bidi="ar-SA"/>
-              </w:rPr>
+                <w:sz w:val="22"/>
+              </w:rPr>
+            </w:pPr>
+            <w:r>
+              <w:rPr>
+                <w:sz w:val="22"/>
+              </w:rPr>
+              <w:t>0%</w:t>
             </w:r>
           </w:p>
         </w:tc>
@@ -984,21 +999,14 @@
               <w:spacing w:lineRule="auto" w:line="240" w:before="0" w:after="0"/>
               <w:jc w:val="center"/>
               <w:rPr>
-                <w:rFonts w:ascii="Calibri" w:hAnsi="Calibri" w:eastAsia="Calibri" w:cs=""/>
-                <w:kern w:val="0"/>
-                <w:sz w:val="22"/>
-                <w:szCs w:val="22"/>
-                <w:lang w:val="en-US" w:eastAsia="en-US" w:bidi="ar-SA"/>
-              </w:rPr>
-            </w:pPr>
-            <w:r>
-              <w:rPr>
-                <w:rFonts w:eastAsia="Calibri" w:cs=""/>
-                <w:kern w:val="0"/>
-                <w:sz w:val="22"/>
-                <w:szCs w:val="22"/>
-                <w:lang w:val="en-US" w:eastAsia="en-US" w:bidi="ar-SA"/>
-              </w:rPr>
+                <w:sz w:val="22"/>
+              </w:rPr>
+            </w:pPr>
+            <w:r>
+              <w:rPr>
+                <w:sz w:val="22"/>
+              </w:rPr>
+              <w:t>0%</w:t>
             </w:r>
           </w:p>
         </w:tc>
@@ -1064,6 +1072,7 @@
                 <w:szCs w:val="22"/>
                 <w:lang w:val="en-US" w:eastAsia="en-US" w:bidi="ar-SA"/>
               </w:rPr>
+              <w:t>Interface Mockup</w:t>
             </w:r>
           </w:p>
         </w:tc>
@@ -1222,6 +1231,7 @@
                 <w:szCs w:val="22"/>
                 <w:lang w:val="en-US" w:eastAsia="en-US" w:bidi="ar-SA"/>
               </w:rPr>
+              <w:t>User’s Guide</w:t>
             </w:r>
           </w:p>
         </w:tc>
@@ -1291,6 +1301,342 @@
           <w:tcPr>
             <w:tcW w:w="1636" w:type="dxa"/>
             <w:tcBorders/>
+          </w:tcPr>
+          <w:p>
+            <w:pPr>
+              <w:pStyle w:val="Normal"/>
+              <w:widowControl/>
+              <w:suppressAutoHyphens w:val="true"/>
+              <w:spacing w:lineRule="auto" w:line="240" w:before="0" w:after="0"/>
+              <w:jc w:val="center"/>
+              <w:rPr>
+                <w:rFonts w:ascii="Calibri" w:hAnsi="Calibri" w:eastAsia="Calibri" w:cs=""/>
+                <w:kern w:val="0"/>
+                <w:sz w:val="22"/>
+                <w:szCs w:val="22"/>
+                <w:lang w:val="en-US" w:eastAsia="en-US" w:bidi="ar-SA"/>
+              </w:rPr>
+            </w:pPr>
+            <w:r>
+              <w:rPr>
+                <w:rFonts w:eastAsia="Calibri" w:cs=""/>
+                <w:kern w:val="0"/>
+                <w:sz w:val="22"/>
+                <w:szCs w:val="22"/>
+                <w:lang w:val="en-US" w:eastAsia="en-US" w:bidi="ar-SA"/>
+              </w:rPr>
+            </w:r>
+          </w:p>
+        </w:tc>
+      </w:tr>
+      <w:tr>
+        <w:trPr/>
+        <w:tc>
+          <w:tcPr>
+            <w:tcW w:w="1815" w:type="dxa"/>
+            <w:tcBorders>
+              <w:top w:val="nil"/>
+            </w:tcBorders>
+          </w:tcPr>
+          <w:p>
+            <w:pPr>
+              <w:pStyle w:val="Normal"/>
+              <w:widowControl/>
+              <w:suppressAutoHyphens w:val="true"/>
+              <w:spacing w:lineRule="auto" w:line="240" w:before="0" w:after="0"/>
+              <w:jc w:val="center"/>
+              <w:rPr>
+                <w:rFonts w:ascii="Calibri" w:hAnsi="Calibri" w:eastAsia="Calibri" w:cs=""/>
+                <w:kern w:val="0"/>
+                <w:sz w:val="22"/>
+                <w:szCs w:val="22"/>
+                <w:lang w:val="en-US" w:eastAsia="en-US" w:bidi="ar-SA"/>
+              </w:rPr>
+            </w:pPr>
+            <w:r>
+              <w:rPr>
+                <w:rFonts w:eastAsia="Calibri" w:cs=""/>
+                <w:kern w:val="0"/>
+                <w:sz w:val="22"/>
+                <w:szCs w:val="22"/>
+                <w:lang w:val="en-US" w:eastAsia="en-US" w:bidi="ar-SA"/>
+              </w:rPr>
+            </w:r>
+          </w:p>
+        </w:tc>
+        <w:tc>
+          <w:tcPr>
+            <w:tcW w:w="1774" w:type="dxa"/>
+            <w:tcBorders>
+              <w:top w:val="nil"/>
+            </w:tcBorders>
+          </w:tcPr>
+          <w:p>
+            <w:pPr>
+              <w:pStyle w:val="Normal"/>
+              <w:widowControl/>
+              <w:suppressAutoHyphens w:val="true"/>
+              <w:spacing w:lineRule="auto" w:line="240" w:before="0" w:after="0"/>
+              <w:jc w:val="center"/>
+              <w:rPr>
+                <w:rFonts w:ascii="Calibri" w:hAnsi="Calibri" w:eastAsia="Calibri" w:cs=""/>
+                <w:kern w:val="0"/>
+                <w:sz w:val="22"/>
+                <w:szCs w:val="22"/>
+                <w:lang w:val="en-US" w:eastAsia="en-US" w:bidi="ar-SA"/>
+              </w:rPr>
+            </w:pPr>
+            <w:r>
+              <w:rPr>
+                <w:rFonts w:eastAsia="Calibri" w:cs=""/>
+                <w:kern w:val="0"/>
+                <w:sz w:val="22"/>
+                <w:szCs w:val="22"/>
+                <w:lang w:val="en-US" w:eastAsia="en-US" w:bidi="ar-SA"/>
+              </w:rPr>
+            </w:r>
+          </w:p>
+        </w:tc>
+        <w:tc>
+          <w:tcPr>
+            <w:tcW w:w="1327" w:type="dxa"/>
+            <w:tcBorders>
+              <w:top w:val="nil"/>
+            </w:tcBorders>
+          </w:tcPr>
+          <w:p>
+            <w:pPr>
+              <w:pStyle w:val="Normal"/>
+              <w:widowControl/>
+              <w:suppressAutoHyphens w:val="true"/>
+              <w:spacing w:lineRule="auto" w:line="240" w:before="0" w:after="0"/>
+              <w:jc w:val="center"/>
+              <w:rPr>
+                <w:rFonts w:ascii="Calibri" w:hAnsi="Calibri" w:eastAsia="Calibri" w:cs=""/>
+                <w:kern w:val="0"/>
+                <w:sz w:val="22"/>
+                <w:szCs w:val="22"/>
+                <w:lang w:val="en-US" w:eastAsia="en-US" w:bidi="ar-SA"/>
+              </w:rPr>
+            </w:pPr>
+            <w:r>
+              <w:rPr>
+                <w:rFonts w:eastAsia="Calibri" w:cs=""/>
+                <w:kern w:val="0"/>
+                <w:sz w:val="22"/>
+                <w:szCs w:val="22"/>
+                <w:lang w:val="en-US" w:eastAsia="en-US" w:bidi="ar-SA"/>
+              </w:rPr>
+            </w:r>
+          </w:p>
+        </w:tc>
+        <w:tc>
+          <w:tcPr>
+            <w:tcW w:w="1515" w:type="dxa"/>
+            <w:tcBorders>
+              <w:top w:val="nil"/>
+            </w:tcBorders>
+          </w:tcPr>
+          <w:p>
+            <w:pPr>
+              <w:pStyle w:val="Normal"/>
+              <w:widowControl/>
+              <w:suppressAutoHyphens w:val="true"/>
+              <w:spacing w:lineRule="auto" w:line="240" w:before="0" w:after="0"/>
+              <w:jc w:val="center"/>
+              <w:rPr>
+                <w:rFonts w:ascii="Calibri" w:hAnsi="Calibri" w:eastAsia="Calibri" w:cs=""/>
+                <w:kern w:val="0"/>
+                <w:sz w:val="22"/>
+                <w:szCs w:val="22"/>
+                <w:lang w:val="en-US" w:eastAsia="en-US" w:bidi="ar-SA"/>
+              </w:rPr>
+            </w:pPr>
+            <w:r>
+              <w:rPr>
+                <w:rFonts w:eastAsia="Calibri" w:cs=""/>
+                <w:kern w:val="0"/>
+                <w:sz w:val="22"/>
+                <w:szCs w:val="22"/>
+                <w:lang w:val="en-US" w:eastAsia="en-US" w:bidi="ar-SA"/>
+              </w:rPr>
+            </w:r>
+          </w:p>
+        </w:tc>
+        <w:tc>
+          <w:tcPr>
+            <w:tcW w:w="1636" w:type="dxa"/>
+            <w:tcBorders>
+              <w:top w:val="nil"/>
+            </w:tcBorders>
+          </w:tcPr>
+          <w:p>
+            <w:pPr>
+              <w:pStyle w:val="Normal"/>
+              <w:widowControl/>
+              <w:suppressAutoHyphens w:val="true"/>
+              <w:spacing w:lineRule="auto" w:line="240" w:before="0" w:after="0"/>
+              <w:jc w:val="center"/>
+              <w:rPr>
+                <w:rFonts w:ascii="Calibri" w:hAnsi="Calibri" w:eastAsia="Calibri" w:cs=""/>
+                <w:kern w:val="0"/>
+                <w:sz w:val="22"/>
+                <w:szCs w:val="22"/>
+                <w:lang w:val="en-US" w:eastAsia="en-US" w:bidi="ar-SA"/>
+              </w:rPr>
+            </w:pPr>
+            <w:r>
+              <w:rPr>
+                <w:rFonts w:eastAsia="Calibri" w:cs=""/>
+                <w:kern w:val="0"/>
+                <w:sz w:val="22"/>
+                <w:szCs w:val="22"/>
+                <w:lang w:val="en-US" w:eastAsia="en-US" w:bidi="ar-SA"/>
+              </w:rPr>
+            </w:r>
+          </w:p>
+        </w:tc>
+      </w:tr>
+      <w:tr>
+        <w:trPr/>
+        <w:tc>
+          <w:tcPr>
+            <w:tcW w:w="1815" w:type="dxa"/>
+            <w:tcBorders>
+              <w:top w:val="nil"/>
+            </w:tcBorders>
+          </w:tcPr>
+          <w:p>
+            <w:pPr>
+              <w:pStyle w:val="Normal"/>
+              <w:widowControl/>
+              <w:suppressAutoHyphens w:val="true"/>
+              <w:spacing w:lineRule="auto" w:line="240" w:before="0" w:after="0"/>
+              <w:jc w:val="center"/>
+              <w:rPr>
+                <w:rFonts w:ascii="Calibri" w:hAnsi="Calibri" w:eastAsia="Calibri" w:cs=""/>
+                <w:kern w:val="0"/>
+                <w:sz w:val="22"/>
+                <w:szCs w:val="22"/>
+                <w:lang w:val="en-US" w:eastAsia="en-US" w:bidi="ar-SA"/>
+              </w:rPr>
+            </w:pPr>
+            <w:r>
+              <w:rPr>
+                <w:rFonts w:eastAsia="Calibri" w:cs=""/>
+                <w:kern w:val="0"/>
+                <w:sz w:val="22"/>
+                <w:szCs w:val="22"/>
+                <w:lang w:val="en-US" w:eastAsia="en-US" w:bidi="ar-SA"/>
+              </w:rPr>
+            </w:r>
+          </w:p>
+        </w:tc>
+        <w:tc>
+          <w:tcPr>
+            <w:tcW w:w="1774" w:type="dxa"/>
+            <w:tcBorders>
+              <w:top w:val="nil"/>
+            </w:tcBorders>
+          </w:tcPr>
+          <w:p>
+            <w:pPr>
+              <w:pStyle w:val="Normal"/>
+              <w:widowControl/>
+              <w:suppressAutoHyphens w:val="true"/>
+              <w:spacing w:lineRule="auto" w:line="240" w:before="0" w:after="0"/>
+              <w:jc w:val="center"/>
+              <w:rPr>
+                <w:rFonts w:ascii="Calibri" w:hAnsi="Calibri" w:eastAsia="Calibri" w:cs=""/>
+                <w:kern w:val="0"/>
+                <w:sz w:val="22"/>
+                <w:szCs w:val="22"/>
+                <w:lang w:val="en-US" w:eastAsia="en-US" w:bidi="ar-SA"/>
+              </w:rPr>
+            </w:pPr>
+            <w:r>
+              <w:rPr>
+                <w:rFonts w:eastAsia="Calibri" w:cs=""/>
+                <w:kern w:val="0"/>
+                <w:sz w:val="22"/>
+                <w:szCs w:val="22"/>
+                <w:lang w:val="en-US" w:eastAsia="en-US" w:bidi="ar-SA"/>
+              </w:rPr>
+            </w:r>
+          </w:p>
+        </w:tc>
+        <w:tc>
+          <w:tcPr>
+            <w:tcW w:w="1327" w:type="dxa"/>
+            <w:tcBorders>
+              <w:top w:val="nil"/>
+            </w:tcBorders>
+          </w:tcPr>
+          <w:p>
+            <w:pPr>
+              <w:pStyle w:val="Normal"/>
+              <w:widowControl/>
+              <w:suppressAutoHyphens w:val="true"/>
+              <w:spacing w:lineRule="auto" w:line="240" w:before="0" w:after="0"/>
+              <w:jc w:val="center"/>
+              <w:rPr>
+                <w:rFonts w:ascii="Calibri" w:hAnsi="Calibri" w:eastAsia="Calibri" w:cs=""/>
+                <w:kern w:val="0"/>
+                <w:sz w:val="22"/>
+                <w:szCs w:val="22"/>
+                <w:lang w:val="en-US" w:eastAsia="en-US" w:bidi="ar-SA"/>
+              </w:rPr>
+            </w:pPr>
+            <w:r>
+              <w:rPr>
+                <w:rFonts w:eastAsia="Calibri" w:cs=""/>
+                <w:kern w:val="0"/>
+                <w:sz w:val="22"/>
+                <w:szCs w:val="22"/>
+                <w:lang w:val="en-US" w:eastAsia="en-US" w:bidi="ar-SA"/>
+              </w:rPr>
+            </w:r>
+          </w:p>
+        </w:tc>
+        <w:tc>
+          <w:tcPr>
+            <w:tcW w:w="1515" w:type="dxa"/>
+            <w:tcBorders>
+              <w:top w:val="nil"/>
+            </w:tcBorders>
+          </w:tcPr>
+          <w:p>
+            <w:pPr>
+              <w:pStyle w:val="Normal"/>
+              <w:widowControl/>
+              <w:suppressAutoHyphens w:val="true"/>
+              <w:spacing w:lineRule="auto" w:line="240" w:before="0" w:after="0"/>
+              <w:jc w:val="center"/>
+              <w:rPr>
+                <w:rFonts w:ascii="Calibri" w:hAnsi="Calibri" w:eastAsia="Calibri" w:cs=""/>
+                <w:kern w:val="0"/>
+                <w:sz w:val="22"/>
+                <w:szCs w:val="22"/>
+                <w:lang w:val="en-US" w:eastAsia="en-US" w:bidi="ar-SA"/>
+              </w:rPr>
+            </w:pPr>
+            <w:r>
+              <w:rPr>
+                <w:rFonts w:eastAsia="Calibri" w:cs=""/>
+                <w:kern w:val="0"/>
+                <w:sz w:val="22"/>
+                <w:szCs w:val="22"/>
+                <w:lang w:val="en-US" w:eastAsia="en-US" w:bidi="ar-SA"/>
+              </w:rPr>
+            </w:r>
+          </w:p>
+        </w:tc>
+        <w:tc>
+          <w:tcPr>
+            <w:tcW w:w="1636" w:type="dxa"/>
+            <w:tcBorders>
+              <w:top w:val="nil"/>
+            </w:tcBorders>
           </w:tcPr>
           <w:p>
             <w:pPr>
@@ -1853,8 +2199,31 @@
       <w:rFonts w:cs="Arial"/>
     </w:rPr>
   </w:style>
-  <w:style w:type="numbering" w:styleId="Style16" w:default="1">
-    <w:name w:val="Без маркерів"/>
+  <w:style w:type="paragraph" w:styleId="Style16">
+    <w:name w:val="Вміст таблиці"/>
+    <w:basedOn w:val="Normal"/>
+    <w:qFormat/>
+    <w:pPr>
+      <w:widowControl w:val="false"/>
+      <w:suppressLineNumbers/>
+    </w:pPr>
+    <w:rPr/>
+  </w:style>
+  <w:style w:type="paragraph" w:styleId="Style17">
+    <w:name w:val="Заголовок таблиці"/>
+    <w:basedOn w:val="Style16"/>
+    <w:qFormat/>
+    <w:pPr>
+      <w:suppressLineNumbers/>
+      <w:jc w:val="center"/>
+    </w:pPr>
+    <w:rPr>
+      <w:b/>
+      <w:bCs/>
+    </w:rPr>
+  </w:style>
+  <w:style w:type="numbering" w:styleId="user2" w:default="1">
+    <w:name w:val="Без маркерів (user)"/>
     <w:uiPriority w:val="99"/>
     <w:semiHidden/>
     <w:unhideWhenUsed/>

</xml_diff>